<commit_message>
Untruncate activity step-slide eyebrows (v7)
The eyebrow on every activity step slide was the activity title cut to
38 characters, so it read "ACTIVITY 4 · Improve — Choose and Pilot a
Counterme". It now carries the DMAIC phase instead — "ACTIVITY 4 ·
IMPROVE" — which is what the eyebrow is for; the full title already sits
in the H1 directly beneath it.

Clears the one cosmetic finding from the v6 audit, which otherwise
passed. Version bumped v6 -> v7; v6 artifacts archived.

Co-Authored-By: Claude Opus 5 <noreply@anthropic.com>
</commit_message>
<xml_diff>
--- a/courseware/LG-Certified Lean Six Sigma White Belt (CLSSWB) Training.docx
+++ b/courseware/LG-Certified Lean Six Sigma White Belt (CLSSWB) Training.docx
@@ -179,7 +179,7 @@
           <w:color w:val="1F6FEB"/>
           <w:sz w:val="24"/>
         </w:rPr>
-        <w:t>Version 6</w:t>
+        <w:t>Version 7</w:t>
       </w:r>
     </w:p>
     <w:p>
@@ -631,6 +631,64 @@
           </w:p>
         </w:tc>
       </w:tr>
+      <w:tr>
+        <w:tc>
+          <w:tcPr>
+            <w:tcW w:type="dxa" w:w="2160"/>
+          </w:tcPr>
+          <w:p>
+            <w:r/>
+            <w:r>
+              <w:rPr>
+                <w:sz w:val="19"/>
+              </w:rPr>
+              <w:t>7</w:t>
+            </w:r>
+          </w:p>
+        </w:tc>
+        <w:tc>
+          <w:tcPr>
+            <w:tcW w:type="dxa" w:w="2160"/>
+          </w:tcPr>
+          <w:p>
+            <w:r/>
+            <w:r>
+              <w:rPr>
+                <w:sz w:val="19"/>
+              </w:rPr>
+              <w:t>23 September 2026</w:t>
+            </w:r>
+          </w:p>
+        </w:tc>
+        <w:tc>
+          <w:tcPr>
+            <w:tcW w:type="dxa" w:w="2160"/>
+          </w:tcPr>
+          <w:p>
+            <w:r/>
+            <w:r>
+              <w:rPr>
+                <w:sz w:val="19"/>
+              </w:rPr>
+              <w:t>Activity step slides now carry the DMAIC phase in the eyebrow (ACTIVITY N - PHASE) instead of a character-truncated activity title.</w:t>
+            </w:r>
+          </w:p>
+        </w:tc>
+        <w:tc>
+          <w:tcPr>
+            <w:tcW w:type="dxa" w:w="2160"/>
+          </w:tcPr>
+          <w:p>
+            <w:r/>
+            <w:r>
+              <w:rPr>
+                <w:sz w:val="19"/>
+              </w:rPr>
+              <w:t>Dr. Alfred Ang</w:t>
+            </w:r>
+          </w:p>
+        </w:tc>
+      </w:tr>
     </w:tbl>
     <w:p>
       <w:r>

</xml_diff>